<commit_message>
Show exact source URLs instead of the bare help.grab.com domain
Every FAQ document previously credited its source as "help.grab.com", which
is not specific enough to verify or re-scrape a given answer. Each document
now carries the precise URLs it was built from:

- Banner and every subcategory header show the exact category URL.
- Each subcategory ends with the exact article URLs scraped for it —
  55 for Transport, 35 for Food, 4 for Loans.

Co-Authored-By: Claude Opus 5 <noreply@anthropic.com>
Claude-Session: https://claude.ai/code/session_01CyJRDCSC3pzoJ4gAtg3ACM
</commit_message>
<xml_diff>
--- a/Grab_FAQ_Food_Branded.docx
+++ b/Grab_FAQ_Food_Branded.docx
@@ -54,7 +54,7 @@
                 <w:color w:val="E8F7EE"/>
                 <w:sz w:val="21"/>
               </w:rPr>
-              <w:t>Singapore (en-sg) · AI-agent reference · Scraped from help.grab.com</w:t>
+              <w:t>Singapore (en-sg) · AI-agent reference · Source: https://help.grab.com/passenger/en-sg/115002258448-Food</w:t>
             </w:r>
           </w:p>
         </w:tc>
@@ -140,7 +140,7 @@
                 <w:color w:val="E8F7EE"/>
                 <w:sz w:val="18"/>
               </w:rPr>
-              <w:t>Source: help.grab.com</w:t>
+              <w:t>Source: https://help.grab.com/passenger/en-sg/115002258448-Food</w:t>
             </w:r>
           </w:p>
         </w:tc>
@@ -1673,6 +1673,150 @@
           <w:sz w:val="21"/>
         </w:rPr>
         <w:t>Grab collects Point of Interest (POI) data through crowdsourcing from users across Southeast Asia. You can contribute by going to Map your City in the Grab app and adding missing places on the map. If a business listing has incorrect information, update it using the Update place feature under Map your City — submitted edits are verified by the team before the app is updated.</w:t>
+      </w:r>
+    </w:p>
+    <w:p>
+      <w:pPr>
+        <w:spacing w:before="160" w:after="20"/>
+      </w:pPr>
+      <w:r>
+        <w:rPr>
+          <w:b/>
+          <w:i/>
+          <w:color w:val="5F6B63"/>
+          <w:sz w:val="17"/>
+        </w:rPr>
+        <w:t>Scraped from:</w:t>
+      </w:r>
+    </w:p>
+    <w:p>
+      <w:pPr>
+        <w:spacing w:after="0"/>
+        <w:ind w:left="317"/>
+      </w:pPr>
+      <w:r>
+        <w:rPr>
+          <w:color w:val="5F6B63"/>
+          <w:sz w:val="17"/>
+        </w:rPr>
+        <w:t>https://help.grab.com/passenger/en-sg/360001025888-About-GrabFood</w:t>
+      </w:r>
+    </w:p>
+    <w:p>
+      <w:pPr>
+        <w:spacing w:after="0"/>
+        <w:ind w:left="317"/>
+      </w:pPr>
+      <w:r>
+        <w:rPr>
+          <w:color w:val="5F6B63"/>
+          <w:sz w:val="17"/>
+        </w:rPr>
+        <w:t>https://help.grab.com/passenger/en-sg/360033340451-Place-a-GrabFood-web-order</w:t>
+      </w:r>
+    </w:p>
+    <w:p>
+      <w:pPr>
+        <w:spacing w:after="0"/>
+        <w:ind w:left="317"/>
+      </w:pPr>
+      <w:r>
+        <w:rPr>
+          <w:color w:val="5F6B63"/>
+          <w:sz w:val="17"/>
+        </w:rPr>
+        <w:t>https://help.grab.com/passenger/en-sg/24787799508377-About-food-lockers</w:t>
+      </w:r>
+    </w:p>
+    <w:p>
+      <w:pPr>
+        <w:spacing w:after="0"/>
+        <w:ind w:left="317"/>
+      </w:pPr>
+      <w:r>
+        <w:rPr>
+          <w:color w:val="5F6B63"/>
+          <w:sz w:val="17"/>
+        </w:rPr>
+        <w:t>https://help.grab.com/passenger/en-sg/40001229-About-On-Time-Promise</w:t>
+      </w:r>
+    </w:p>
+    <w:p>
+      <w:pPr>
+        <w:spacing w:after="0"/>
+        <w:ind w:left="317"/>
+      </w:pPr>
+      <w:r>
+        <w:rPr>
+          <w:color w:val="5F6B63"/>
+          <w:sz w:val="17"/>
+        </w:rPr>
+        <w:t>https://help.grab.com/passenger/en-sg/4409686626585-Send-an-overseas-delivery</w:t>
+      </w:r>
+    </w:p>
+    <w:p>
+      <w:pPr>
+        <w:spacing w:after="0"/>
+        <w:ind w:left="317"/>
+      </w:pPr>
+      <w:r>
+        <w:rPr>
+          <w:color w:val="5F6B63"/>
+          <w:sz w:val="17"/>
+        </w:rPr>
+        <w:t>https://help.grab.com/passenger/en-sg/900005239166-About-Scan-to-Order</w:t>
+      </w:r>
+    </w:p>
+    <w:p>
+      <w:pPr>
+        <w:spacing w:after="0"/>
+        <w:ind w:left="317"/>
+      </w:pPr>
+      <w:r>
+        <w:rPr>
+          <w:color w:val="5F6B63"/>
+          <w:sz w:val="17"/>
+        </w:rPr>
+        <w:t>https://help.grab.com/passenger/en-sg/40000780-Personalise-your-dietary-preferences</w:t>
+      </w:r>
+    </w:p>
+    <w:p>
+      <w:pPr>
+        <w:spacing w:after="0"/>
+        <w:ind w:left="317"/>
+      </w:pPr>
+      <w:r>
+        <w:rPr>
+          <w:color w:val="5F6B63"/>
+          <w:sz w:val="17"/>
+        </w:rPr>
+        <w:t>https://help.grab.com/passenger/en-sg/40001390-Healthier-options-on-GrabFood</w:t>
+      </w:r>
+    </w:p>
+    <w:p>
+      <w:pPr>
+        <w:spacing w:after="0"/>
+        <w:ind w:left="317"/>
+      </w:pPr>
+      <w:r>
+        <w:rPr>
+          <w:color w:val="5F6B63"/>
+          <w:sz w:val="17"/>
+        </w:rPr>
+        <w:t>https://help.grab.com/passenger/en-sg/33896609543961-About-Deal-information</w:t>
+      </w:r>
+    </w:p>
+    <w:p>
+      <w:pPr>
+        <w:spacing w:after="0"/>
+        <w:ind w:left="317"/>
+      </w:pPr>
+      <w:r>
+        <w:rPr>
+          <w:color w:val="5F6B63"/>
+          <w:sz w:val="17"/>
+        </w:rPr>
+        <w:t>https://help.grab.com/passenger/en-sg/23101648622105-About-store-listings</w:t>
       </w:r>
     </w:p>
     <w:p/>
@@ -1734,7 +1878,7 @@
                 <w:color w:val="E8F7EE"/>
                 <w:sz w:val="18"/>
               </w:rPr>
-              <w:t>Source: help.grab.com</w:t>
+              <w:t>Source: https://help.grab.com/passenger/en-sg/115002258448-Food</w:t>
             </w:r>
           </w:p>
         </w:tc>
@@ -2247,6 +2391,59 @@
           <w:sz w:val="21"/>
         </w:rPr>
         <w:t>Rate your experience through the Grab app. Your input helps Grab improve and ensures delivery-partners and merchant-partners maintain high service standards.</w:t>
+      </w:r>
+    </w:p>
+    <w:p>
+      <w:pPr>
+        <w:spacing w:before="160" w:after="20"/>
+      </w:pPr>
+      <w:r>
+        <w:rPr>
+          <w:b/>
+          <w:i/>
+          <w:color w:val="5F6B63"/>
+          <w:sz w:val="17"/>
+        </w:rPr>
+        <w:t>Scraped from:</w:t>
+      </w:r>
+    </w:p>
+    <w:p>
+      <w:pPr>
+        <w:spacing w:after="0"/>
+        <w:ind w:left="317"/>
+      </w:pPr>
+      <w:r>
+        <w:rPr>
+          <w:color w:val="5F6B63"/>
+          <w:sz w:val="17"/>
+        </w:rPr>
+        <w:t>https://help.grab.com/passenger/en-sg/360001018427-Check-your-order-status</w:t>
+      </w:r>
+    </w:p>
+    <w:p>
+      <w:pPr>
+        <w:spacing w:after="0"/>
+        <w:ind w:left="317"/>
+      </w:pPr>
+      <w:r>
+        <w:rPr>
+          <w:color w:val="5F6B63"/>
+          <w:sz w:val="17"/>
+        </w:rPr>
+        <w:t>https://help.grab.com/passenger/en-sg/360026984451-Change-your-order-details</w:t>
+      </w:r>
+    </w:p>
+    <w:p>
+      <w:pPr>
+        <w:spacing w:after="0"/>
+        <w:ind w:left="317"/>
+      </w:pPr>
+      <w:r>
+        <w:rPr>
+          <w:color w:val="5F6B63"/>
+          <w:sz w:val="17"/>
+        </w:rPr>
+        <w:t>https://help.grab.com/passenger/en-sg/34184057467801-Cancelling-your-order</w:t>
       </w:r>
     </w:p>
     <w:p/>
@@ -2308,7 +2505,7 @@
                 <w:color w:val="E8F7EE"/>
                 <w:sz w:val="18"/>
               </w:rPr>
-              <w:t>Source: help.grab.com</w:t>
+              <w:t>Source: https://help.grab.com/passenger/en-sg/115002258448-Food</w:t>
             </w:r>
           </w:p>
         </w:tc>
@@ -3014,6 +3211,59 @@
           <w:sz w:val="21"/>
         </w:rPr>
         <w:t>Go to Account &gt; Loyalty Programs in your Grab app to view your ongoing stamp cards. To stop receiving partner marketing communications, go to Account &gt; Settings &gt; Communications &gt; Your selected loyalty merchants and toggle off the merchants you wish to opt out from.</w:t>
+      </w:r>
+    </w:p>
+    <w:p>
+      <w:pPr>
+        <w:spacing w:before="160" w:after="20"/>
+      </w:pPr>
+      <w:r>
+        <w:rPr>
+          <w:b/>
+          <w:i/>
+          <w:color w:val="5F6B63"/>
+          <w:sz w:val="17"/>
+        </w:rPr>
+        <w:t>Scraped from:</w:t>
+      </w:r>
+    </w:p>
+    <w:p>
+      <w:pPr>
+        <w:spacing w:after="0"/>
+        <w:ind w:left="317"/>
+      </w:pPr>
+      <w:r>
+        <w:rPr>
+          <w:color w:val="5F6B63"/>
+          <w:sz w:val="17"/>
+        </w:rPr>
+        <w:t>https://help.grab.com/passenger/en-sg/40000999-Create-a-Saved-Group</w:t>
+      </w:r>
+    </w:p>
+    <w:p>
+      <w:pPr>
+        <w:spacing w:after="0"/>
+        <w:ind w:left="317"/>
+      </w:pPr>
+      <w:r>
+        <w:rPr>
+          <w:color w:val="5F6B63"/>
+          <w:sz w:val="17"/>
+        </w:rPr>
+        <w:t>https://help.grab.com/passenger/en-sg/40001714-Robot-Delivery-at-Grab-One-North</w:t>
+      </w:r>
+    </w:p>
+    <w:p>
+      <w:pPr>
+        <w:spacing w:after="0"/>
+        <w:ind w:left="317"/>
+      </w:pPr>
+      <w:r>
+        <w:rPr>
+          <w:color w:val="5F6B63"/>
+          <w:sz w:val="17"/>
+        </w:rPr>
+        <w:t>https://help.grab.com/passenger/en-sg/24078911736217-Earn-and-redeem-stamps</w:t>
       </w:r>
     </w:p>
     <w:p/>
@@ -3075,7 +3325,7 @@
                 <w:color w:val="E8F7EE"/>
                 <w:sz w:val="18"/>
               </w:rPr>
-              <w:t>Source: help.grab.com</w:t>
+              <w:t>Source: https://help.grab.com/passenger/en-sg/115002258448-Food</w:t>
             </w:r>
           </w:p>
         </w:tc>
@@ -3836,6 +4086,72 @@
           <w:sz w:val="21"/>
         </w:rPr>
         <w:t>On your Grab app homepage, go to the Dine Out tile and browse deals. Before completing your purchase, tap the “Apply more offers” option and select the Eatfluencer Dine Out reward assigned to you. Make sure the offer is successfully applied before finalising your purchase.</w:t>
+      </w:r>
+    </w:p>
+    <w:p>
+      <w:pPr>
+        <w:spacing w:before="160" w:after="20"/>
+      </w:pPr>
+      <w:r>
+        <w:rPr>
+          <w:b/>
+          <w:i/>
+          <w:color w:val="5F6B63"/>
+          <w:sz w:val="17"/>
+        </w:rPr>
+        <w:t>Scraped from:</w:t>
+      </w:r>
+    </w:p>
+    <w:p>
+      <w:pPr>
+        <w:spacing w:after="0"/>
+        <w:ind w:left="317"/>
+      </w:pPr>
+      <w:r>
+        <w:rPr>
+          <w:color w:val="5F6B63"/>
+          <w:sz w:val="17"/>
+        </w:rPr>
+        <w:t>https://help.grab.com/passenger/en-sg/35128731708953-About-the-Discover-page</w:t>
+      </w:r>
+    </w:p>
+    <w:p>
+      <w:pPr>
+        <w:spacing w:after="0"/>
+        <w:ind w:left="317"/>
+      </w:pPr>
+      <w:r>
+        <w:rPr>
+          <w:color w:val="5F6B63"/>
+          <w:sz w:val="17"/>
+        </w:rPr>
+        <w:t>https://help.grab.com/passenger/en-sg/40000689-About-the-Discover-page</w:t>
+      </w:r>
+    </w:p>
+    <w:p>
+      <w:pPr>
+        <w:spacing w:after="0"/>
+        <w:ind w:left="317"/>
+      </w:pPr>
+      <w:r>
+        <w:rPr>
+          <w:color w:val="5F6B63"/>
+          <w:sz w:val="17"/>
+        </w:rPr>
+        <w:t>https://help.grab.com/passenger/en-sg/40001399-About-Eatfluencers</w:t>
+      </w:r>
+    </w:p>
+    <w:p>
+      <w:pPr>
+        <w:spacing w:after="0"/>
+        <w:ind w:left="317"/>
+      </w:pPr>
+      <w:r>
+        <w:rPr>
+          <w:color w:val="5F6B63"/>
+          <w:sz w:val="17"/>
+        </w:rPr>
+        <w:t>https://help.grab.com/passenger/en-sg/40001521-Can-t-post-on-Discover-page</w:t>
       </w:r>
     </w:p>
     <w:p/>
@@ -3897,7 +4213,7 @@
                 <w:color w:val="E8F7EE"/>
                 <w:sz w:val="18"/>
               </w:rPr>
-              <w:t>Source: help.grab.com</w:t>
+              <w:t>Source: https://help.grab.com/passenger/en-sg/115002258448-Food</w:t>
             </w:r>
           </w:p>
         </w:tc>
@@ -4107,6 +4423,33 @@
           <w:sz w:val="21"/>
         </w:rPr>
         <w:t>From 1 January 2023 onwards, all GrabFood orders include a Platform Fee of $0.40, which helps Grab keep improving its service and technology to provide the best experience, deals and restaurant selection. The Partner Fee component supports the welfare of driver- and delivery-partners, as well as contributions to the Central Provident Fund (CPF) and Work Injury Compensation Insurance (WICA), which are mandatory under the Platform Workers Act. Neither fee applies to pickup orders.</w:t>
+      </w:r>
+    </w:p>
+    <w:p>
+      <w:pPr>
+        <w:spacing w:before="160" w:after="20"/>
+      </w:pPr>
+      <w:r>
+        <w:rPr>
+          <w:b/>
+          <w:i/>
+          <w:color w:val="5F6B63"/>
+          <w:sz w:val="17"/>
+        </w:rPr>
+        <w:t>Scraped from:</w:t>
+      </w:r>
+    </w:p>
+    <w:p>
+      <w:pPr>
+        <w:spacing w:after="0"/>
+        <w:ind w:left="317"/>
+      </w:pPr>
+      <w:r>
+        <w:rPr>
+          <w:color w:val="5F6B63"/>
+          <w:sz w:val="17"/>
+        </w:rPr>
+        <w:t>https://help.grab.com/passenger/en-sg/115015723367-GrabFood-delivery-fees</w:t>
       </w:r>
     </w:p>
     <w:p/>
@@ -4168,7 +4511,7 @@
                 <w:color w:val="E8F7EE"/>
                 <w:sz w:val="18"/>
               </w:rPr>
-              <w:t>Source: help.grab.com</w:t>
+              <w:t>Source: https://help.grab.com/passenger/en-sg/115002258448-Food</w:t>
             </w:r>
           </w:p>
         </w:tc>
@@ -5262,6 +5605,137 @@
           <w:sz w:val="21"/>
         </w:rPr>
         <w:t>The 100+ Cities Delivery feature is only available in selected cities and countries, which may change from time to time, so your destination may not be covered. Check that all delivery and contact details have been included in the booking. For payment, only credit and debit cards are accepted for cross-border orders, while intercity orders also accept GrabPay credits, GrabPay Mastercard and e-wallets. Report any problem with a 100+ Cities Delivery booking within 12 hours of your delivery time.</w:t>
+      </w:r>
+    </w:p>
+    <w:p>
+      <w:pPr>
+        <w:spacing w:before="160" w:after="20"/>
+      </w:pPr>
+      <w:r>
+        <w:rPr>
+          <w:b/>
+          <w:i/>
+          <w:color w:val="5F6B63"/>
+          <w:sz w:val="17"/>
+        </w:rPr>
+        <w:t>Scraped from:</w:t>
+      </w:r>
+    </w:p>
+    <w:p>
+      <w:pPr>
+        <w:spacing w:after="0"/>
+        <w:ind w:left="317"/>
+      </w:pPr>
+      <w:r>
+        <w:rPr>
+          <w:color w:val="5F6B63"/>
+          <w:sz w:val="17"/>
+        </w:rPr>
+        <w:t>https://help.grab.com/passenger/en-sg/360041516152-How-can-I-report-an-issue-with-my-order</w:t>
+      </w:r>
+    </w:p>
+    <w:p>
+      <w:pPr>
+        <w:spacing w:after="0"/>
+        <w:ind w:left="317"/>
+      </w:pPr>
+      <w:r>
+        <w:rPr>
+          <w:color w:val="5F6B63"/>
+          <w:sz w:val="17"/>
+        </w:rPr>
+        <w:t>https://help.grab.com/passenger/en-sg/360026092132-Why-your-order-was-cancelled</w:t>
+      </w:r>
+    </w:p>
+    <w:p>
+      <w:pPr>
+        <w:spacing w:after="0"/>
+        <w:ind w:left="317"/>
+      </w:pPr>
+      <w:r>
+        <w:rPr>
+          <w:color w:val="5F6B63"/>
+          <w:sz w:val="17"/>
+        </w:rPr>
+        <w:t>https://help.grab.com/passenger/en-sg/360035181172-Didn-t-receive-completed-order</w:t>
+      </w:r>
+    </w:p>
+    <w:p>
+      <w:pPr>
+        <w:spacing w:after="0"/>
+        <w:ind w:left="317"/>
+      </w:pPr>
+      <w:r>
+        <w:rPr>
+          <w:color w:val="5F6B63"/>
+          <w:sz w:val="17"/>
+        </w:rPr>
+        <w:t>https://help.grab.com/passenger/en-sg/360002059867-Missing-or-wrong-items-in-your-order</w:t>
+      </w:r>
+    </w:p>
+    <w:p>
+      <w:pPr>
+        <w:spacing w:after="0"/>
+        <w:ind w:left="317"/>
+      </w:pPr>
+      <w:r>
+        <w:rPr>
+          <w:color w:val="5F6B63"/>
+          <w:sz w:val="17"/>
+        </w:rPr>
+        <w:t>https://help.grab.com/passenger/en-sg/360034220692-Food-arrived-spilled-or-damaged</w:t>
+      </w:r>
+    </w:p>
+    <w:p>
+      <w:pPr>
+        <w:spacing w:after="0"/>
+        <w:ind w:left="317"/>
+      </w:pPr>
+      <w:r>
+        <w:rPr>
+          <w:color w:val="5F6B63"/>
+          <w:sz w:val="17"/>
+        </w:rPr>
+        <w:t>https://help.grab.com/passenger/en-sg/360034220592-Order-instructions-were-not-followed</w:t>
+      </w:r>
+    </w:p>
+    <w:p>
+      <w:pPr>
+        <w:spacing w:after="0"/>
+        <w:ind w:left="317"/>
+      </w:pPr>
+      <w:r>
+        <w:rPr>
+          <w:color w:val="5F6B63"/>
+          <w:sz w:val="17"/>
+        </w:rPr>
+        <w:t>https://help.grab.com/passenger/en-sg/360040853372-Report-a-closed-restaurant</w:t>
+      </w:r>
+    </w:p>
+    <w:p>
+      <w:pPr>
+        <w:spacing w:after="0"/>
+        <w:ind w:left="317"/>
+      </w:pPr>
+      <w:r>
+        <w:rPr>
+          <w:color w:val="5F6B63"/>
+          <w:sz w:val="17"/>
+        </w:rPr>
+        <w:t>https://help.grab.com/passenger/en-sg/360000180447-Report-incorrect-restaurant-information</w:t>
+      </w:r>
+    </w:p>
+    <w:p>
+      <w:pPr>
+        <w:spacing w:after="0"/>
+        <w:ind w:left="317"/>
+      </w:pPr>
+      <w:r>
+        <w:rPr>
+          <w:color w:val="5F6B63"/>
+          <w:sz w:val="17"/>
+        </w:rPr>
+        <w:t>https://help.grab.com/passenger/en-sg/4409678916633-Can-t-send-an-overseas-delivery</w:t>
       </w:r>
     </w:p>
     <w:p/>
@@ -5323,7 +5797,7 @@
                 <w:color w:val="E8F7EE"/>
                 <w:sz w:val="18"/>
               </w:rPr>
-              <w:t>Source: help.grab.com</w:t>
+              <w:t>Source: https://help.grab.com/passenger/en-sg/115002258448-Food</w:t>
             </w:r>
           </w:p>
         </w:tc>
@@ -5450,6 +5924,33 @@
           <w:sz w:val="21"/>
         </w:rPr>
         <w:t>Select Activity at the bottom navigation bar of the Grab App, select the Coke&amp;Go order the refund is being requested for, then copy the Booking ID using the copy icon.</w:t>
+      </w:r>
+    </w:p>
+    <w:p>
+      <w:pPr>
+        <w:spacing w:before="160" w:after="20"/>
+      </w:pPr>
+      <w:r>
+        <w:rPr>
+          <w:b/>
+          <w:i/>
+          <w:color w:val="5F6B63"/>
+          <w:sz w:val="17"/>
+        </w:rPr>
+        <w:t>Scraped from:</w:t>
+      </w:r>
+    </w:p>
+    <w:p>
+      <w:pPr>
+        <w:spacing w:after="0"/>
+        <w:ind w:left="317"/>
+      </w:pPr>
+      <w:r>
+        <w:rPr>
+          <w:color w:val="5F6B63"/>
+          <w:sz w:val="17"/>
+        </w:rPr>
+        <w:t>https://help.grab.com/passenger/en-sg/36355147963801-Request-refund-for-Coke-Go</w:t>
       </w:r>
     </w:p>
     <w:p/>
@@ -5511,7 +6012,7 @@
                 <w:color w:val="E8F7EE"/>
                 <w:sz w:val="18"/>
               </w:rPr>
-              <w:t>Source: help.grab.com</w:t>
+              <w:t>Source: https://help.grab.com/passenger/en-sg/115002258448-Food</w:t>
             </w:r>
           </w:p>
         </w:tc>
@@ -6256,6 +6757,72 @@
           <w:sz w:val="21"/>
         </w:rPr>
         <w:t>Before checkout, view the breakdown on the Order Summary page. After checkout, check the bill in the app or the email receipt.</w:t>
+      </w:r>
+    </w:p>
+    <w:p>
+      <w:pPr>
+        <w:spacing w:before="160" w:after="20"/>
+      </w:pPr>
+      <w:r>
+        <w:rPr>
+          <w:b/>
+          <w:i/>
+          <w:color w:val="5F6B63"/>
+          <w:sz w:val="17"/>
+        </w:rPr>
+        <w:t>Scraped from:</w:t>
+      </w:r>
+    </w:p>
+    <w:p>
+      <w:pPr>
+        <w:spacing w:after="0"/>
+        <w:ind w:left="317"/>
+      </w:pPr>
+      <w:r>
+        <w:rPr>
+          <w:color w:val="5F6B63"/>
+          <w:sz w:val="17"/>
+        </w:rPr>
+        <w:t>https://help.grab.com/passenger/en-sg/900002947223-About-Priority-Delivery</w:t>
+      </w:r>
+    </w:p>
+    <w:p>
+      <w:pPr>
+        <w:spacing w:after="0"/>
+        <w:ind w:left="317"/>
+      </w:pPr>
+      <w:r>
+        <w:rPr>
+          <w:color w:val="5F6B63"/>
+          <w:sz w:val="17"/>
+        </w:rPr>
+        <w:t>https://help.grab.com/passenger/en-sg/360002059967-About-Scheduled-Orders</w:t>
+      </w:r>
+    </w:p>
+    <w:p>
+      <w:pPr>
+        <w:spacing w:after="0"/>
+        <w:ind w:left="317"/>
+      </w:pPr>
+      <w:r>
+        <w:rPr>
+          <w:color w:val="5F6B63"/>
+          <w:sz w:val="17"/>
+        </w:rPr>
+        <w:t>https://help.grab.com/passenger/en-sg/360035729452-About-Self-Pick-up</w:t>
+      </w:r>
+    </w:p>
+    <w:p>
+      <w:pPr>
+        <w:spacing w:after="0"/>
+        <w:ind w:left="317"/>
+      </w:pPr>
+      <w:r>
+        <w:rPr>
+          <w:color w:val="5F6B63"/>
+          <w:sz w:val="17"/>
+        </w:rPr>
+        <w:t>https://help.grab.com/passenger/en-sg/360042839972-About-Group-Orders</w:t>
       </w:r>
     </w:p>
     <w:p/>

</xml_diff>